<commit_message>
Update two-week report with work merged from main
Co-Authored-By: Claude Sonnet 5.5 <noreply@anthropic.com>
Claude-Session: https://claude.ai/code/session_01EiyjMmBJBkbzhQqskDix9p
</commit_message>
<xml_diff>
--- a/reports/2026-10-23-two-week-changes.docx
+++ b/reports/2026-10-23-two-week-changes.docx
@@ -2,7 +2,7 @@
 <file path=word/document.xml><?xml version="1.0" encoding="utf-8"?>
 <w:document xmlns:w="http://schemas.openxmlformats.org/wordprocessingml/2006/main" xmlns:m="http://schemas.openxmlformats.org/officeDocument/2006/math" xmlns:r="http://schemas.openxmlformats.org/officeDocument/2006/relationships" xmlns:o="urn:schemas-microsoft-com:office:office" xmlns:v="urn:schemas-microsoft-com:vml" xmlns:w10="urn:schemas-microsoft-com:office:word" xmlns:a="http://schemas.openxmlformats.org/drawingml/2006/main" xmlns:pic="http://schemas.openxmlformats.org/drawingml/2006/picture" xmlns:wp="http://schemas.openxmlformats.org/drawingml/2006/wordprocessingDrawing">
   <w:body>
-    <w:bookmarkStart w:id="28" w:name="X00a7be0d9c9fe3c172b8ca46a1aab6b9d2797ec"/>
+    <w:bookmarkStart w:id="29" w:name="X00a7be0d9c9fe3c172b8ca46a1aab6b9d2797ec"/>
     <w:p>
       <w:pPr>
         <w:pStyle w:val="Heading1"/>
@@ -26,7 +26,7 @@
         <w:t xml:space="preserve"> </w:t>
       </w:r>
       <w:r>
-        <w:t xml:space="preserve">114 non-merge commits, 13–23 Oct (320 files, about +37,300 / −2,200 lines). Release</w:t>
+        <w:t xml:space="preserve">about 135 non-merge commits (352 files, about +41,200 / −2,500 lines), now including everything merged from</w:t>
       </w:r>
       <w:r>
         <w:t xml:space="preserve"> </w:t>
@@ -35,13 +35,61 @@
         <w:rPr>
           <w:rStyle w:val="VerbatimChar"/>
         </w:rPr>
+        <w:t xml:space="preserve">main</w:t>
+      </w:r>
+      <w:r>
+        <w:t xml:space="preserve"> </w:t>
+      </w:r>
+      <w:r>
+        <w:t xml:space="preserve">on 24 Oct. Release</w:t>
+      </w:r>
+      <w:r>
+        <w:t xml:space="preserve"> </w:t>
+      </w:r>
+      <w:r>
+        <w:rPr>
+          <w:rStyle w:val="VerbatimChar"/>
+        </w:rPr>
         <w:t xml:space="preserve">akye-v2026.10.23</w:t>
       </w:r>
       <w:r>
         <w:t xml:space="preserve"> </w:t>
       </w:r>
       <w:r>
-        <w:t xml:space="preserve">was cut on 23 Oct.</w:t>
+        <w:t xml:space="preserve">was cut on 23 Oct. Work after that release is on</w:t>
+      </w:r>
+      <w:r>
+        <w:t xml:space="preserve"> </w:t>
+      </w:r>
+      <w:r>
+        <w:rPr>
+          <w:rStyle w:val="VerbatimChar"/>
+        </w:rPr>
+        <w:t xml:space="preserve">main</w:t>
+      </w:r>
+      <w:r>
+        <w:t xml:space="preserve"> </w:t>
+      </w:r>
+      <w:r>
+        <w:t xml:space="preserve">only and is marked</w:t>
+      </w:r>
+      <w:r>
+        <w:t xml:space="preserve"> </w:t>
+      </w:r>
+      <w:r>
+        <w:t xml:space="preserve">“</w:t>
+      </w:r>
+      <w:r>
+        <w:t xml:space="preserve">not yet released</w:t>
+      </w:r>
+      <w:r>
+        <w:t xml:space="preserve">”</w:t>
+      </w:r>
+      <w:r>
+        <w:t xml:space="preserve"> </w:t>
+      </w:r>
+      <w:r>
+        <w:t xml:space="preserve">below.</w:t>
       </w:r>
       <w:r>
         <w:t xml:space="preserve"> </w:t>
@@ -56,7 +104,7 @@
         <w:rPr>
           <w:rStyle w:val="VerbatimChar"/>
         </w:rPr>
-        <w:t xml:space="preserve">git log --since="2 weeks ago"</w:t>
+        <w:t xml:space="preserve">git log --since=2026-10-10</w:t>
       </w:r>
       <w:r>
         <w:t xml:space="preserve">.</w:t>
@@ -1576,12 +1624,367 @@
       </w:r>
     </w:p>
     <w:bookmarkEnd w:id="26"/>
-    <w:bookmarkStart w:id="27" w:name="follow-ups-seen-in-the-log"/>
+    <w:bookmarkStart w:id="27" w:name="X068ca980f857732e3a254ff1e8e2f26e3dff7dc"/>
     <w:p>
       <w:pPr>
         <w:pStyle w:val="Heading2"/>
       </w:pPr>
       <w:r>
+        <w:t xml:space="preserve">7. Added since the 23 Oct release (on</w:t>
+      </w:r>
+      <w:r>
+        <w:t xml:space="preserve"> </w:t>
+      </w:r>
+      <w:r>
+        <w:rPr>
+          <w:rStyle w:val="VerbatimChar"/>
+        </w:rPr>
+        <w:t xml:space="preserve">main</w:t>
+      </w:r>
+      <w:r>
+        <w:t xml:space="preserve">, not yet released)</w:t>
+      </w:r>
+    </w:p>
+    <w:p>
+      <w:pPr>
+        <w:numPr>
+          <w:ilvl w:val="0"/>
+          <w:numId w:val="1016"/>
+        </w:numPr>
+        <w:pStyle w:val="Compact"/>
+      </w:pPr>
+      <w:r>
+        <w:rPr>
+          <w:bCs/>
+          <w:b/>
+        </w:rPr>
+        <w:t xml:space="preserve">Console Release page</w:t>
+      </w:r>
+      <w:r>
+        <w:t xml:space="preserve"> </w:t>
+      </w:r>
+      <w:r>
+        <w:t xml:space="preserve">at</w:t>
+      </w:r>
+      <w:r>
+        <w:t xml:space="preserve"> </w:t>
+      </w:r>
+      <w:r>
+        <w:rPr>
+          <w:rStyle w:val="VerbatimChar"/>
+        </w:rPr>
+        <w:t xml:space="preserve">/console/release</w:t>
+      </w:r>
+      <w:r>
+        <w:t xml:space="preserve"> </w:t>
+      </w:r>
+      <w:r>
+        <w:t xml:space="preserve">(#154): reviews</w:t>
+      </w:r>
+      <w:r>
+        <w:t xml:space="preserve"> </w:t>
+      </w:r>
+      <w:r>
+        <w:rPr>
+          <w:rStyle w:val="VerbatimChar"/>
+        </w:rPr>
+        <w:t xml:space="preserve">main</w:t>
+      </w:r>
+      <w:r>
+        <w:t xml:space="preserve"> </w:t>
+      </w:r>
+      <w:r>
+        <w:t xml:space="preserve">against</w:t>
+      </w:r>
+      <w:r>
+        <w:t xml:space="preserve"> </w:t>
+      </w:r>
+      <w:r>
+        <w:rPr>
+          <w:rStyle w:val="VerbatimChar"/>
+        </w:rPr>
+        <w:t xml:space="preserve">akye-stable</w:t>
+      </w:r>
+      <w:r>
+        <w:t xml:space="preserve"> </w:t>
+      </w:r>
+      <w:r>
+        <w:t xml:space="preserve">and lists blockers. It has a Release button (</w:t>
+      </w:r>
+      <w:r>
+        <w:rPr>
+          <w:rStyle w:val="VerbatimChar"/>
+        </w:rPr>
+        <w:t xml:space="preserve">/console/release/go</w:t>
+      </w:r>
+      <w:r>
+        <w:t xml:space="preserve">) and a Roll back button (</w:t>
+      </w:r>
+      <w:r>
+        <w:rPr>
+          <w:rStyle w:val="VerbatimChar"/>
+        </w:rPr>
+        <w:t xml:space="preserve">/console/release/rollback</w:t>
+      </w:r>
+      <w:r>
+        <w:t xml:space="preserve">). The review binds to both ends of the reviewed diff, snapshots by commit, and uses wider risk patterns. The repo name comes from</w:t>
+      </w:r>
+      <w:r>
+        <w:t xml:space="preserve"> </w:t>
+      </w:r>
+      <w:r>
+        <w:rPr>
+          <w:rStyle w:val="VerbatimChar"/>
+        </w:rPr>
+        <w:t xml:space="preserve">GITHUB_REPO</w:t>
+      </w:r>
+      <w:r>
+        <w:t xml:space="preserve">.</w:t>
+      </w:r>
+    </w:p>
+    <w:p>
+      <w:pPr>
+        <w:numPr>
+          <w:ilvl w:val="0"/>
+          <w:numId w:val="1016"/>
+        </w:numPr>
+        <w:pStyle w:val="Compact"/>
+      </w:pPr>
+      <w:r>
+        <w:rPr>
+          <w:bCs/>
+          <w:b/>
+        </w:rPr>
+        <w:t xml:space="preserve">Commercial accounts:</w:t>
+      </w:r>
+      <w:r>
+        <w:t xml:space="preserve"> </w:t>
+      </w:r>
+      <w:r>
+        <w:t xml:space="preserve">book scheduled, confirmed jobs paid by card or invoice. Jobs get full repeats, no residential commission, a real morning invoice and scope fixes. Commercial jobs pay the commercial cleaner cost, not the residential rate. Migration renumbered to 0035.</w:t>
+      </w:r>
+    </w:p>
+    <w:p>
+      <w:pPr>
+        <w:numPr>
+          <w:ilvl w:val="0"/>
+          <w:numId w:val="1016"/>
+        </w:numPr>
+        <w:pStyle w:val="Compact"/>
+      </w:pPr>
+      <w:r>
+        <w:rPr>
+          <w:bCs/>
+          <w:b/>
+        </w:rPr>
+        <w:t xml:space="preserve">Pay rate:</w:t>
+      </w:r>
+      <w:r>
+        <w:t xml:space="preserve"> </w:t>
+      </w:r>
+      <w:r>
+        <w:t xml:space="preserve">new companies start paying cleaners $25 an hour. Existing companies keep theirs, and restoring an old backup keeps $43.</w:t>
+      </w:r>
+    </w:p>
+    <w:p>
+      <w:pPr>
+        <w:numPr>
+          <w:ilvl w:val="0"/>
+          <w:numId w:val="1016"/>
+        </w:numPr>
+        <w:pStyle w:val="Compact"/>
+      </w:pPr>
+      <w:r>
+        <w:rPr>
+          <w:bCs/>
+          <w:b/>
+        </w:rPr>
+        <w:t xml:space="preserve">Simpler booking (#148):</w:t>
+      </w:r>
+      <w:r>
+        <w:t xml:space="preserve"> </w:t>
+      </w:r>
+      <w:r>
+        <w:t xml:space="preserve">New Booking form, and one place for each fact on the booking page.</w:t>
+      </w:r>
+    </w:p>
+    <w:p>
+      <w:pPr>
+        <w:numPr>
+          <w:ilvl w:val="0"/>
+          <w:numId w:val="1016"/>
+        </w:numPr>
+        <w:pStyle w:val="Compact"/>
+      </w:pPr>
+      <w:r>
+        <w:rPr>
+          <w:bCs/>
+          <w:b/>
+        </w:rPr>
+        <w:t xml:space="preserve">Book again:</w:t>
+      </w:r>
+      <w:r>
+        <w:t xml:space="preserve"> </w:t>
+      </w:r>
+      <w:r>
+        <w:t xml:space="preserve">the form is an inline expandable at the top of the booking. It posts in the background, confirms inline, is safe to retry, and uses one-off confirmation wording.</w:t>
+      </w:r>
+    </w:p>
+    <w:p>
+      <w:pPr>
+        <w:numPr>
+          <w:ilvl w:val="0"/>
+          <w:numId w:val="1016"/>
+        </w:numPr>
+        <w:pStyle w:val="Compact"/>
+      </w:pPr>
+      <w:r>
+        <w:rPr>
+          <w:bCs/>
+          <w:b/>
+        </w:rPr>
+        <w:t xml:space="preserve">Console:</w:t>
+      </w:r>
+    </w:p>
+    <w:p>
+      <w:pPr>
+        <w:numPr>
+          <w:ilvl w:val="1"/>
+          <w:numId w:val="1017"/>
+        </w:numPr>
+        <w:pStyle w:val="Compact"/>
+      </w:pPr>
+      <w:r>
+        <w:t xml:space="preserve">Support meter, owner activity, and three</w:t>
+      </w:r>
+      <w:r>
+        <w:t xml:space="preserve"> </w:t>
+      </w:r>
+      <w:r>
+        <w:t xml:space="preserve">“</w:t>
+      </w:r>
+      <w:r>
+        <w:t xml:space="preserve">gone quiet</w:t>
+      </w:r>
+      <w:r>
+        <w:t xml:space="preserve">”</w:t>
+      </w:r>
+      <w:r>
+        <w:t xml:space="preserve"> </w:t>
+      </w:r>
+      <w:r>
+        <w:t xml:space="preserve">emails (off until switched on). The meter counts done visits, and a switched-off email no longer holds the next.</w:t>
+      </w:r>
+    </w:p>
+    <w:p>
+      <w:pPr>
+        <w:numPr>
+          <w:ilvl w:val="1"/>
+          <w:numId w:val="1017"/>
+        </w:numPr>
+        <w:pStyle w:val="Compact"/>
+      </w:pPr>
+      <w:r>
+        <w:t xml:space="preserve">Companies table reads company, then Support.</w:t>
+      </w:r>
+    </w:p>
+    <w:p>
+      <w:pPr>
+        <w:numPr>
+          <w:ilvl w:val="1"/>
+          <w:numId w:val="1017"/>
+        </w:numPr>
+        <w:pStyle w:val="Compact"/>
+      </w:pPr>
+      <w:r>
+        <w:t xml:space="preserve">Partners pages drop the funnel tabs.</w:t>
+      </w:r>
+    </w:p>
+    <w:p>
+      <w:pPr>
+        <w:numPr>
+          <w:ilvl w:val="1"/>
+          <w:numId w:val="1017"/>
+        </w:numPr>
+        <w:pStyle w:val="Compact"/>
+      </w:pPr>
+      <w:r>
+        <w:t xml:space="preserve">Three false console errors were fixed.</w:t>
+      </w:r>
+    </w:p>
+    <w:p>
+      <w:pPr>
+        <w:numPr>
+          <w:ilvl w:val="0"/>
+          <w:numId w:val="1016"/>
+        </w:numPr>
+        <w:pStyle w:val="Compact"/>
+      </w:pPr>
+      <w:r>
+        <w:rPr>
+          <w:bCs/>
+          <w:b/>
+        </w:rPr>
+        <w:t xml:space="preserve">City switch:</w:t>
+      </w:r>
+      <w:r>
+        <w:t xml:space="preserve"> </w:t>
+      </w:r>
+      <w:r>
+        <w:t xml:space="preserve">one login, two cities. The menu reads each company’s own city.</w:t>
+      </w:r>
+    </w:p>
+    <w:p>
+      <w:pPr>
+        <w:numPr>
+          <w:ilvl w:val="0"/>
+          <w:numId w:val="1016"/>
+        </w:numPr>
+        <w:pStyle w:val="Compact"/>
+      </w:pPr>
+      <w:r>
+        <w:rPr>
+          <w:bCs/>
+          <w:b/>
+        </w:rPr>
+        <w:t xml:space="preserve">Charging safety:</w:t>
+      </w:r>
+      <w:r>
+        <w:t xml:space="preserve"> </w:t>
+      </w:r>
+      <w:r>
+        <w:t xml:space="preserve">two clocks must not charge one card twice. A runbook describes how the charging clock moves.</w:t>
+      </w:r>
+    </w:p>
+    <w:p>
+      <w:pPr>
+        <w:numPr>
+          <w:ilvl w:val="0"/>
+          <w:numId w:val="1016"/>
+        </w:numPr>
+        <w:pStyle w:val="Compact"/>
+      </w:pPr>
+      <w:r>
+        <w:rPr>
+          <w:bCs/>
+          <w:b/>
+        </w:rPr>
+        <w:t xml:space="preserve">Earlier work now merged in:</w:t>
+      </w:r>
+      <w:r>
+        <w:t xml:space="preserve"> </w:t>
+      </w:r>
+      <w:r>
+        <w:t xml:space="preserve">the confirmation email carries the terms. The blog moved off the application. Interview recordings are signed on upload and private on read. Interview-recording evidence is inside the release gate, and a purged company takes its recordings with it.</w:t>
+      </w:r>
+    </w:p>
+    <w:bookmarkEnd w:id="27"/>
+    <w:bookmarkStart w:id="28" w:name="follow-ups-seen-in-the-log"/>
+    <w:p>
+      <w:pPr>
+        <w:pStyle w:val="Heading2"/>
+      </w:pPr>
+      <w:r>
         <w:t xml:space="preserve">Follow-ups seen in the log</w:t>
       </w:r>
     </w:p>
@@ -1589,7 +1992,7 @@
       <w:pPr>
         <w:numPr>
           <w:ilvl w:val="0"/>
-          <w:numId w:val="1016"/>
+          <w:numId w:val="1018"/>
         </w:numPr>
         <w:pStyle w:val="Compact"/>
       </w:pPr>
@@ -1601,7 +2004,7 @@
       <w:pPr>
         <w:numPr>
           <w:ilvl w:val="0"/>
-          <w:numId w:val="1016"/>
+          <w:numId w:val="1018"/>
         </w:numPr>
         <w:pStyle w:val="Compact"/>
       </w:pPr>
@@ -1609,8 +2012,8 @@
         <w:t xml:space="preserve">Manual releases need a second person, so schedule that into release days.</w:t>
       </w:r>
     </w:p>
-    <w:bookmarkEnd w:id="27"/>
     <w:bookmarkEnd w:id="28"/>
+    <w:bookmarkEnd w:id="29"/>
     <w:sectPr/>
   </w:body>
 </w:document>
@@ -1954,6 +2357,12 @@
     <w:abstractNumId w:val="991"/>
   </w:num>
   <w:num w:numId="1016">
+    <w:abstractNumId w:val="991"/>
+  </w:num>
+  <w:num w:numId="1017">
+    <w:abstractNumId w:val="991"/>
+  </w:num>
+  <w:num w:numId="1018">
     <w:abstractNumId w:val="991"/>
   </w:num>
 </w:numbering>

</xml_diff>